<commit_message>
ran all examples for documentation and updated their output
</commit_message>
<xml_diff>
--- a/exported_docs_examples/outfile.docx
+++ b/exported_docs_examples/outfile.docx
@@ -344,15 +344,6 @@
         </w:rPr>
         <w:t xml:space="preserve">}</w:t>
       </w:r>
-      <w:r>
-        <w:br/>
-      </w:r>
-      <w:r>
-        <w:rPr>
-          <w:rStyle w:val="VerbatimChar"/>
-        </w:rPr>
-        <w:t xml:space="preserve">        </w:t>
-      </w:r>
     </w:p>
     <w:p>
       <w:pPr>
@@ -371,7 +362,7 @@
         <w:pStyle w:val="BodyText"/>
       </w:pPr>
       <w:r>
-        <w:t xml:space="preserve">this is how to embed a table:</w:t>
+        <w:t xml:space="preserve">This is how to embed a table:</w:t>
       </w:r>
     </w:p>
     <w:tbl>
@@ -602,6 +593,24 @@
         </w:drawing>
       </w:r>
     </w:p>
+    <w:p>
+      <w:pPr>
+        <w:pStyle w:val="BodyText"/>
+      </w:pPr>
+      <w:r>
+        <w:rPr>
+          <w:b/>
+          <w:bCs/>
+        </w:rPr>
+        <w:t xml:space="preserve">Figure 1:</w:t>
+      </w:r>
+      <w:r>
+        <w:t xml:space="preserve"> </w:t>
+      </w:r>
+      <w:r>
+        <w:t xml:space="preserve">This is an example image.</w:t>
+      </w:r>
+    </w:p>
     <w:sectPr>
       <w:footnotePr>
         <w:numRestart w:val="eachSect"/>
@@ -694,7 +703,7 @@
     </w:lvl>
   </w:abstractNum>
   <w:abstractNum w:abstractNumId="1">
-    <w:nsid w:val="01E7EAAC"/>
+    <w:nsid w:val="0114DA40"/>
     <w:multiLevelType w:val="multilevel"/>
     <w:lvl w:ilvl="0">
       <w:numFmt w:val="bullet"/>

</xml_diff>